<commit_message>
Fix: Fully integrate turn timer and roleplay logic in Station2
</commit_message>
<xml_diff>
--- a/Kế hoạch triển khai thử nghiệm cho SV/Thông báo về VipeSpeak cho SV.docx
+++ b/Kế hoạch triển khai thử nghiệm cho SV/Thông báo về VipeSpeak cho SV.docx
@@ -86,7 +86,23 @@
           <w:sz w:val="24"/>
           <w:szCs w:val="24"/>
         </w:rPr>
-        <w:t xml:space="preserve">Chào các em, nhằm giúp các em xóa bỏ rào cản sợ nói và nâng cao phản xạ tiếng Anh, thầy/cô chính thức triển khai nền tảng </w:t>
+        <w:t>Chào các em, nhằm giúp các em xóa bỏ rào cản sợ nói và nâng</w:t>
+      </w:r>
+      <w:r>
+        <w:rPr>
+          <w:rFonts w:eastAsia="Times New Roman" w:cs="Times New Roman"/>
+          <w:sz w:val="24"/>
+          <w:szCs w:val="24"/>
+        </w:rPr>
+        <w:t xml:space="preserve"> cao phản xạ tiếng Anh, thầy </w:t>
+      </w:r>
+      <w:r>
+        <w:rPr>
+          <w:rFonts w:eastAsia="Times New Roman" w:cs="Times New Roman"/>
+          <w:sz w:val="24"/>
+          <w:szCs w:val="24"/>
+        </w:rPr>
+        <w:t xml:space="preserve">chính thức triển khai nền tảng </w:t>
       </w:r>
       <w:r>
         <w:rPr>
@@ -150,6 +166,16 @@
         </w:rPr>
         <w:t xml:space="preserve"> Quét mã QR (hoặc truy cập link Vercel) trên điện thoại/máy tính. </w:t>
       </w:r>
+    </w:p>
+    <w:p>
+      <w:pPr>
+        <w:spacing w:before="100" w:beforeAutospacing="1" w:after="100" w:afterAutospacing="1" w:line="240" w:lineRule="auto"/>
+        <w:rPr>
+          <w:rFonts w:eastAsia="Times New Roman" w:cs="Times New Roman"/>
+          <w:sz w:val="24"/>
+          <w:szCs w:val="24"/>
+        </w:rPr>
+      </w:pPr>
       <w:r>
         <w:rPr>
           <w:rFonts w:ascii="Segoe UI Symbol" w:eastAsia="Times New Roman" w:hAnsi="Segoe UI Symbol" w:cs="Segoe UI Symbol"/>
@@ -232,6 +258,18 @@
         </w:rPr>
         <w:t xml:space="preserve">). </w:t>
       </w:r>
+    </w:p>
+    <w:p>
+      <w:pPr>
+        <w:spacing w:before="100" w:beforeAutospacing="1" w:after="100" w:afterAutospacing="1" w:line="240" w:lineRule="auto"/>
+        <w:rPr>
+          <w:rFonts w:eastAsia="Times New Roman" w:cs="Times New Roman"/>
+          <w:sz w:val="24"/>
+          <w:szCs w:val="24"/>
+        </w:rPr>
+      </w:pPr>
+      <w:bookmarkStart w:id="0" w:name="_GoBack"/>
+      <w:bookmarkEnd w:id="0"/>
       <w:r>
         <w:rPr>
           <w:rFonts w:ascii="Segoe UI Symbol" w:eastAsia="Times New Roman" w:hAnsi="Segoe UI Symbol" w:cs="Segoe UI Symbol"/>
@@ -337,10 +375,7 @@
       </w:pPr>
     </w:p>
     <w:p/>
-    <w:p>
-      <w:bookmarkStart w:id="0" w:name="_GoBack"/>
-      <w:bookmarkEnd w:id="0"/>
-    </w:p>
+    <w:p/>
     <w:sectPr>
       <w:pgSz w:w="12240" w:h="15840"/>
       <w:pgMar w:top="1440" w:right="1440" w:bottom="1440" w:left="1440" w:header="720" w:footer="720" w:gutter="0"/>

</xml_diff>